<commit_message>
docs: add RM Dashboard section and contact validation to spec v2
Added Section 5.6 (RM Dashboard) with business-language description of
the KPI strip, escalation queue, card layout, Langfuse trace links, and
conversation transcript fetch logic. Also corrected Tool 5 entry:
- heading: marks it as a LangChain @tool callable by the LLM (not a
  utility function)
- purpose: reflects actual validate-then-save behaviour
- inputs: updated from the original placeholder to the real 17 parameters
- added "Contact validation" row: mobile (10-digit, 6-9 prefix, +91/91/0
  accepted) and email (RFC-5321 surface check) rules plus the
  escalation_saved=False retry flow on failure

Co-Authored-By: Claude Sonnet 4.6 <noreply@anthropic.com>
</commit_message>
<xml_diff>
--- a/docs/specification_v2.docx
+++ b/docs/specification_v2.docx
@@ -3680,6 +3680,324 @@
     <w:p>
       <w:r>
         <w:br w:type="page"/>
+      </w:r>
+    </w:p>
+    <w:p>
+      <w:pPr>
+        <w:pStyle w:val="Heading2"/>
+        <w:spacing w:before="140" w:after="60"/>
+      </w:pPr>
+      <w:r>
+        <w:rPr>
+          <w:rFonts w:ascii="Arial" w:hAnsi="Arial"/>
+          <w:color w:val="2E74B5"/>
+          <w:sz w:val="24"/>
+        </w:rPr>
+        <w:t>5.6 RM Dashboard  (Relationship Manager Portal)</w:t>
+      </w:r>
+    </w:p>
+    <w:p>
+      <w:pPr>
+        <w:spacing w:before="60" w:after="60"/>
+      </w:pPr>
+      <w:r>
+        <w:rPr>
+          <w:rFonts w:ascii="Arial" w:hAnsi="Arial"/>
+          <w:sz w:val="20"/>
+        </w:rPr>
+        <w:t xml:space="preserve">The RM Dashboard is a dedicated tab in the Streamlit web application that gives Relationship Managers a real-time view of all escalated loan enquiries, the customer profiles behind them, and the full conversation each customer had with the AI copilot. It is built exclusively for bank staff — customers never see this tab.</w:t>
+      </w:r>
+    </w:p>
+    <w:p>
+      <w:pPr>
+        <w:spacing w:before="60" w:after="60"/>
+      </w:pPr>
+      <w:r>
+        <w:rPr>
+          <w:rFonts w:ascii="Arial" w:hAnsi="Arial"/>
+          <w:b/>
+          <w:sz w:val="20"/>
+        </w:rPr>
+        <w:t xml:space="preserve">KPI Strip (top of page)</w:t>
+      </w:r>
+    </w:p>
+    <w:p>
+      <w:pPr>
+        <w:spacing w:before="60" w:after="60"/>
+      </w:pPr>
+      <w:r>
+        <w:rPr>
+          <w:rFonts w:ascii="Arial" w:hAnsi="Arial"/>
+          <w:sz w:val="20"/>
+        </w:rPr>
+        <w:t xml:space="preserve">Five at-a-glance metrics are displayed as Streamlit metric tiles across the top of the dashboard, refreshed on every page load:</w:t>
+      </w:r>
+    </w:p>
+    <w:p>
+      <w:pPr>
+        <w:spacing w:before="60" w:after="60"/>
+        <w:ind w:left="480" w:hanging="240"/>
+      </w:pPr>
+      <w:r>
+        <w:rPr>
+          <w:rFonts w:ascii="Arial" w:hAnsi="Arial"/>
+          <w:sz w:val="20"/>
+        </w:rPr>
+        <w:t xml:space="preserve">•  Total Escalations — count of all escalated leads on file</w:t>
+      </w:r>
+    </w:p>
+    <w:p>
+      <w:pPr>
+        <w:spacing w:before="60" w:after="60"/>
+        <w:ind w:left="480" w:hanging="240"/>
+      </w:pPr>
+      <w:r>
+        <w:rPr>
+          <w:rFonts w:ascii="Arial" w:hAnsi="Arial"/>
+          <w:sz w:val="20"/>
+        </w:rPr>
+        <w:t xml:space="preserve">•  Feedback Entries — number of per-turn star-ratings collected</w:t>
+      </w:r>
+    </w:p>
+    <w:p>
+      <w:pPr>
+        <w:spacing w:before="60" w:after="60"/>
+        <w:ind w:left="480" w:hanging="240"/>
+      </w:pPr>
+      <w:r>
+        <w:rPr>
+          <w:rFonts w:ascii="Arial" w:hAnsi="Arial"/>
+          <w:sz w:val="20"/>
+        </w:rPr>
+        <w:t xml:space="preserve">•  Average Rating — mean star rating across the last 20 entries (1–5 ★)</w:t>
+      </w:r>
+    </w:p>
+    <w:p>
+      <w:pPr>
+        <w:spacing w:before="60" w:after="60"/>
+        <w:ind w:left="480" w:hanging="240"/>
+      </w:pPr>
+      <w:r>
+        <w:rPr>
+          <w:rFonts w:ascii="Arial" w:hAnsi="Arial"/>
+          <w:sz w:val="20"/>
+        </w:rPr>
+        <w:t xml:space="preserve">•  Session Turns — number of conversation turns in the current session</w:t>
+      </w:r>
+    </w:p>
+    <w:p>
+      <w:pPr>
+        <w:spacing w:before="60" w:after="60"/>
+        <w:ind w:left="480" w:hanging="240"/>
+      </w:pPr>
+      <w:r>
+        <w:rPr>
+          <w:rFonts w:ascii="Arial" w:hAnsi="Arial"/>
+          <w:sz w:val="20"/>
+        </w:rPr>
+        <w:t xml:space="preserve">•  P95 Latency — 95th-percentile agent response time; flagged “over 5 s SLA” if breached</w:t>
+      </w:r>
+    </w:p>
+    <w:p>
+      <w:pPr>
+        <w:spacing w:before="60" w:after="60"/>
+      </w:pPr>
+      <w:r>
+        <w:rPr>
+          <w:rFonts w:ascii="Arial" w:hAnsi="Arial"/>
+          <w:b/>
+          <w:sz w:val="20"/>
+        </w:rPr>
+        <w:t xml:space="preserve">Escalation Queue</w:t>
+      </w:r>
+    </w:p>
+    <w:p>
+      <w:pPr>
+        <w:spacing w:before="60" w:after="60"/>
+      </w:pPr>
+      <w:r>
+        <w:rPr>
+          <w:rFonts w:ascii="Arial" w:hAnsi="Arial"/>
+          <w:sz w:val="20"/>
+        </w:rPr>
+        <w:t xml:space="preserve">All escalated records are listed in reverse-chronological order (newest first). Each record is shown as a collapsible card labelled with the customer name, loan product icon, requested amount, and enquiry date. The most recent record is expanded by default. Records carry a colour-coded age badge:</w:t>
+      </w:r>
+    </w:p>
+    <w:p>
+      <w:pPr>
+        <w:spacing w:before="60" w:after="60"/>
+        <w:ind w:left="480" w:hanging="240"/>
+      </w:pPr>
+      <w:r>
+        <w:rPr>
+          <w:rFonts w:ascii="Arial" w:hAnsi="Arial"/>
+          <w:sz w:val="20"/>
+        </w:rPr>
+        <w:t xml:space="preserve">•  🟡 NEW — escalated within the last 24 hours (requires same-day RM action)</w:t>
+      </w:r>
+    </w:p>
+    <w:p>
+      <w:pPr>
+        <w:spacing w:before="60" w:after="60"/>
+        <w:ind w:left="480" w:hanging="240"/>
+      </w:pPr>
+      <w:r>
+        <w:rPr>
+          <w:rFonts w:ascii="Arial" w:hAnsi="Arial"/>
+          <w:sz w:val="20"/>
+        </w:rPr>
+        <w:t xml:space="preserve">•  🔵 PENDING — escalated 24–72 hours ago</w:t>
+      </w:r>
+    </w:p>
+    <w:p>
+      <w:pPr>
+        <w:spacing w:before="60" w:after="60"/>
+        <w:ind w:left="480" w:hanging="240"/>
+      </w:pPr>
+      <w:r>
+        <w:rPr>
+          <w:rFonts w:ascii="Arial" w:hAnsi="Arial"/>
+          <w:sz w:val="20"/>
+        </w:rPr>
+        <w:t xml:space="preserve">•  ⚪ OLDER — escalated more than 72 hours ago</w:t>
+      </w:r>
+    </w:p>
+    <w:p>
+      <w:pPr>
+        <w:spacing w:before="60" w:after="60"/>
+      </w:pPr>
+      <w:r>
+        <w:rPr>
+          <w:rFonts w:ascii="Arial" w:hAnsi="Arial"/>
+          <w:b/>
+          <w:sz w:val="20"/>
+        </w:rPr>
+        <w:t xml:space="preserve">Information shown on each escalation card</w:t>
+      </w:r>
+    </w:p>
+    <w:p>
+      <w:pPr>
+        <w:spacing w:before="60" w:after="60"/>
+      </w:pPr>
+      <w:r>
+        <w:rPr>
+          <w:rFonts w:ascii="Arial" w:hAnsi="Arial"/>
+          <w:sz w:val="20"/>
+        </w:rPr>
+        <w:t xml:space="preserve">Each card displays two side-by-side columns:</w:t>
+      </w:r>
+    </w:p>
+    <w:p>
+      <w:pPr>
+        <w:spacing w:before="60" w:after="60"/>
+        <w:ind w:left="480" w:hanging="240"/>
+      </w:pPr>
+      <w:r>
+        <w:rPr>
+          <w:rFonts w:ascii="Arial" w:hAnsi="Arial"/>
+          <w:sz w:val="20"/>
+        </w:rPr>
+        <w:t xml:space="preserve">•  Contact column — customer name (with gender-aware salutation Mr./Ms.), mobile number (10-digit validated), email address, gender, and preferred call-back time as provided by the customer.</w:t>
+      </w:r>
+    </w:p>
+    <w:p>
+      <w:pPr>
+        <w:spacing w:before="60" w:after="60"/>
+        <w:ind w:left="480" w:hanging="240"/>
+      </w:pPr>
+      <w:r>
+        <w:rPr>
+          <w:rFonts w:ascii="Arial" w:hAnsi="Arial"/>
+          <w:sz w:val="20"/>
+        </w:rPr>
+        <w:t xml:space="preserve">•  Loan column — product name, requested amount, monthly income, CIBIL score, age, employment type, and requested tenure (displayed as years and months for readability).</w:t>
+      </w:r>
+    </w:p>
+    <w:p>
+      <w:pPr>
+        <w:spacing w:before="60" w:after="60"/>
+      </w:pPr>
+      <w:r>
+        <w:rPr>
+          <w:rFonts w:ascii="Arial" w:hAnsi="Arial"/>
+          <w:sz w:val="20"/>
+        </w:rPr>
+        <w:t xml:space="preserve">Below the columns, each card shows the escalation reason in plain language (e.g. “Loan amount ₹2.2 Cr exceeds Home Loan advisory ceiling ₹1.5 Cr”), the conversation summary drafted by the agent, and a nested expander with the full conversation transcript (collapsed by default).</w:t>
+      </w:r>
+    </w:p>
+    <w:p>
+      <w:pPr>
+        <w:spacing w:before="60" w:after="60"/>
+      </w:pPr>
+      <w:r>
+        <w:rPr>
+          <w:rFonts w:ascii="Arial" w:hAnsi="Arial"/>
+          <w:b/>
+          <w:sz w:val="20"/>
+        </w:rPr>
+        <w:t xml:space="preserve">Conversation Transcript — live Langfuse fetch</w:t>
+      </w:r>
+    </w:p>
+    <w:p>
+      <w:pPr>
+        <w:spacing w:before="60" w:after="60"/>
+      </w:pPr>
+      <w:r>
+        <w:rPr>
+          <w:rFonts w:ascii="Arial" w:hAnsi="Arial"/>
+          <w:sz w:val="20"/>
+        </w:rPr>
+        <w:t xml:space="preserve">When a valid session_id is stored with the escalation record, the dashboard attempts a live fetch of the full conversation from Langfuse (cached 5 minutes per session). If the fetch succeeds, the source label reads “📡 Live from Langfuse”; if the Langfuse backend is unavailable it falls back silently to the conversation history stored inside escalations.json at escalation time.</w:t>
+      </w:r>
+    </w:p>
+    <w:p>
+      <w:pPr>
+        <w:spacing w:before="60" w:after="60"/>
+      </w:pPr>
+      <w:r>
+        <w:rPr>
+          <w:rFonts w:ascii="Arial" w:hAnsi="Arial"/>
+          <w:b/>
+          <w:sz w:val="20"/>
+        </w:rPr>
+        <w:t xml:space="preserve">Langfuse Trace Link</w:t>
+      </w:r>
+    </w:p>
+    <w:p>
+      <w:pPr>
+        <w:spacing w:before="60" w:after="60"/>
+      </w:pPr>
+      <w:r>
+        <w:rPr>
+          <w:rFonts w:ascii="Arial" w:hAnsi="Arial"/>
+          <w:sz w:val="20"/>
+        </w:rPr>
+        <w:t xml:space="preserve">Each card footer contains a clickable “🔍 Langfuse trace” hyperlink that opens the full LLM trace for that session in the Langfuse UI — showing every tool call with its input arguments and output, the RAG retrieval similarity scores, and the final LLM response. The link uses Langfuse v4 URL format (/project/{project_id}/traces/{session_id}), resolved at runtime via the Langfuse public API so the link remains valid across project renames or hosting changes.</w:t>
+      </w:r>
+    </w:p>
+    <w:p>
+      <w:pPr>
+        <w:spacing w:before="60" w:after="60"/>
+      </w:pPr>
+      <w:r>
+        <w:rPr>
+          <w:rFonts w:ascii="Arial" w:hAnsi="Arial"/>
+          <w:b/>
+          <w:sz w:val="20"/>
+        </w:rPr>
+        <w:t xml:space="preserve">Escalation Reference ID</w:t>
+      </w:r>
+    </w:p>
+    <w:p>
+      <w:pPr>
+        <w:spacing w:before="60" w:after="60"/>
+      </w:pPr>
+      <w:r>
+        <w:rPr>
+          <w:rFonts w:ascii="Arial" w:hAnsi="Arial"/>
+          <w:sz w:val="20"/>
+        </w:rPr>
+        <w:t xml:space="preserve">Every escalation is assigned a unique Escalation ID (e.g. ESC-20260613-A3F1) shown in the card footer. This ID is also included in the RM Pre-Call Briefing document and escalations.json, allowing the RM to cross-reference the dashboard record with any downstream CRM entry or email thread.</w:t>
       </w:r>
     </w:p>
     <w:p>
@@ -5856,7 +6174,7 @@
           <w:color w:val="2E74B5"/>
           <w:sz w:val="24"/>
         </w:rPr>
-        <w:t>Tool 5: generate_escalation_summary  (Utility — not a LangChain tool)</w:t>
+        <w:t>Tool 5: generate_escalation_summary  (LangChain @tool — callable by the LLM)</w:t>
       </w:r>
     </w:p>
     <w:tbl>
@@ -5992,7 +6310,7 @@
                 <w:rFonts w:ascii="Arial" w:hAnsi="Arial"/>
                 <w:sz w:val="19"/>
               </w:rPr>
-              <w:t>Format existing session state and recent conversation turns into a structured RM brief. Called by the orchestration layer when escalation is triggered — not registered as a LangChain tool and not callable by the LLM.</w:t>
+              <w:t>Generate a structured RM Pre-Call Briefing packet and persist it to escalations.json for the RM Dashboard. Registered as a LangChain @tool so the ReAct agent invokes it directly when an escalation condition is met — ceiling breach, high FOIR, or borderline eligibility. Always validates mobile number and email address before saving; returns validation_errors and does NOT save the record if either is invalid, instructing the agent to re-ask the customer.</w:t>
             </w:r>
           </w:p>
         </w:tc>
@@ -6116,7 +6434,71 @@
                 <w:rFonts w:ascii="Arial" w:hAnsi="Arial"/>
                 <w:sz w:val="19"/>
               </w:rPr>
-              <w:t>session_state (dict)  ·  last 4 conversation turns (list)  ·  escalation_reason (str)</w:t>
+              <w:t>customer_intent (str)  ·  loan_product (str)  ·  loan_amount (float, INR)  ·  monthly_income (float, INR)  ·  escalation_reason (str)  ·  customer_name (str)  ·  callback_number (str)  ·  customer_email (str)  ·  gender (str, optional)  ·  preferred_contact_time (str, optional)  ·  age, employment_type, credit_score, tenure_months, existing_emi_obligations  ·  conversation_summary  ·  session_id (str — links RM Dashboard record to Langfuse trace)</w:t>
+            </w:r>
+          </w:p>
+        </w:tc>
+      </w:tr>
+      <w:tr>
+        <w:tc>
+          <w:tcPr>
+            <w:tcW w:w="2160" w:type="dxa"/>
+            <w:tcBorders>
+              <w:top w:val="single" w:sz="4" w:space="0" w:color="BBBBBB"/>
+              <w:left w:val="single" w:sz="4" w:space="0" w:color="BBBBBB"/>
+              <w:bottom w:val="single" w:sz="4" w:space="0" w:color="BBBBBB"/>
+              <w:right w:val="single" w:sz="4" w:space="0" w:color="BBBBBB"/>
+            </w:tcBorders>
+            <w:shd w:val="clear" w:color="auto" w:fill="EBF3FB"/>
+            <w:tcMar>
+              <w:top w:w="80" w:type="dxa"/>
+              <w:left w:w="120" w:type="dxa"/>
+              <w:bottom w:w="80" w:type="dxa"/>
+              <w:right w:w="120" w:type="dxa"/>
+            </w:tcMar>
+          </w:tcPr>
+          <w:p>
+            <w:pPr>
+              <w:spacing w:before="20" w:after="40"/>
+            </w:pPr>
+            <w:r>
+              <w:rPr>
+                <w:rFonts w:ascii="Arial" w:hAnsi="Arial"/>
+                <w:b/>
+                <w:sz w:val="19"/>
+                <w:color w:val="1F4E79"/>
+              </w:rPr>
+              <w:t>Contact validation</w:t>
+            </w:r>
+          </w:p>
+        </w:tc>
+        <w:tc>
+          <w:tcPr>
+            <w:tcW w:w="11376" w:type="dxa"/>
+            <w:tcBorders>
+              <w:top w:val="single" w:sz="4" w:space="0" w:color="BBBBBB"/>
+              <w:left w:val="single" w:sz="4" w:space="0" w:color="BBBBBB"/>
+              <w:bottom w:val="single" w:sz="4" w:space="0" w:color="BBBBBB"/>
+              <w:right w:val="single" w:sz="4" w:space="0" w:color="BBBBBB"/>
+            </w:tcBorders>
+            <w:shd w:val="clear" w:color="auto" w:fill="FFFFFF"/>
+            <w:tcMar>
+              <w:top w:w="80" w:type="dxa"/>
+              <w:left w:w="120" w:type="dxa"/>
+              <w:bottom w:w="80" w:type="dxa"/>
+              <w:right w:w="120" w:type="dxa"/>
+            </w:tcMar>
+          </w:tcPr>
+          <w:p>
+            <w:pPr>
+              <w:spacing w:before="20" w:after="40"/>
+            </w:pPr>
+            <w:r>
+              <w:rPr>
+                <w:rFonts w:ascii="Arial" w:hAnsi="Arial"/>
+                <w:sz w:val="19"/>
+              </w:rPr>
+              <w:t xml:space="preserve">Mobile number (callback_number): 10 digits, first digit must be 6–9. Accepted prefixes: +91, 91 (12-digit), or 0 (11-digit) — all stripped to 10 digits. Spaces and hyphens are ignored. Numbers starting with 1–5 are rejected. Landline and toll-free patterns are not accepted. Email address (customer_email): validated as local@domain.tld — TLD must be ≥2 characters; bare strings without @ or without a domain suffix are rejected. On failure: tool returns escalation_saved=False plus a validation_errors list naming each invalid field in plain language. The record is never written in a partial state; the agent re-asks the customer for the corrected value(s) and calls the tool again.</w:t>
             </w:r>
           </w:p>
         </w:tc>

</xml_diff>